<commit_message>
docs: clarify Prototype Findings supersessions
</commit_message>
<xml_diff>
--- a/docs/Sorting_Apocalypse_Prototype_Findings_v0.11.docx
+++ b/docs/Sorting_Apocalypse_Prototype_Findings_v0.11.docx
@@ -2512,6 +2512,12 @@
       </w:pPr>
       <w:r>
         <w:t>The layered finish language now required across the bunker makes a coherent material library potentially more important than more prefab geometry. The first shell failure exposed an art-direction/composition problem, not proof that all existing meshes are unusable. Select the source route after a small Foundation-Gate proof rather than treating either existing meshes or generated architecture as automatically sufficient. [M14; V02 §24]</w:t>
+      </w:r>
+    </w:p>
+    <w:p>
+      <w:pPr/>
+      <w:r>
+        <w:t>29 September supersession: this was the pre-EAF evidence state. EAF1–EAF5 subsequently proved the environment material-review, structural-substrate, curated-material, wear, and Receiving architectural-proof pipeline. See §§28–29 for the current result.</w:t>
       </w:r>
     </w:p>
     <w:p>
@@ -12299,7 +12305,7 @@
               <w:rPr>
                 <w:sz w:val="18"/>
               </w:rPr>
-              <w:t>Accepted cordoned freight bay, distinct Dispatch annex, Backlog and passage-like Sorting. The desk has partial aperture visibility and the two long vistas are interrupted. Preserve that reviewed geometry; actual pile-item recognition and reach remain future Receiving tests. [A17]</w:t>
+              <w:t>Accepted cordoned freight bay, distinct Dispatch annex, Backlog and passage-like Sorting. The desk has partial aperture visibility and the two long vistas are interrupted. Preserve that reviewed geometry [A17]. Later Stage B evidence promoted the deterministic TAKE-only presenter and functional freight fixtures, including the current 3.4 m Receiving-only fixture reach; see §27.</w:t>
             </w:r>
           </w:p>
         </w:tc>

</xml_diff>